<commit_message>
Update department to Emerging Science and Technology and branch to Computer Science and Design
</commit_message>
<xml_diff>
--- a/HCI_CIE1_Railway_Booking_Report.docx
+++ b/HCI_CIE1_Railway_Booking_Report.docx
@@ -57,7 +57,7 @@
           <w:color w:val="000000"/>
           <w:sz w:val="22"/>
         </w:rPr>
-        <w:t>DEPARTMENT OF COMPUTER SCIENCE AND DESIGN</w:t>
+        <w:t>DEPARTMENT OF EMERGING SCIENCE AND TECHNOLOGY</w:t>
       </w:r>
     </w:p>
     <w:p>
@@ -3562,7 +3562,7 @@
           <w:color w:val="000000"/>
           <w:sz w:val="20"/>
         </w:rPr>
-        <w:t>In this Continuous Internal Evaluation - 1 (CIE-1) interface submission for Human-Computer Interaction (HCI), an online railway information and booking application (RailSafar) was systematically engineered to resolve long-standing usability bottlenecks in public transit ticketing. By anchoring interface architecture in five foundational Nielsen Usability Heuristics—Visibility of System Status, Match Between System and the Real World, Consistency and Standards, Error Prevention, and Recognition Rather Than Recall—the application delivers a calm, transparent, and resilient user experience. Crucially, the prototype was implemented using purely semantic HTML5 and modular CSS3 without JavaScript, proving that high-performance, accessible, and error-immune user interfaces can be realized through disciplined adherence to fundamental HCI design principles. This submission satisfies all academic requirements prescribed by the Department of Computer Science and Design at Maharashtra Institute of Technology, Chhatrapati Sambhajinagar.</w:t>
+        <w:t>In this Continuous Internal Evaluation - 1 (CIE-1) interface submission for Human-Computer Interaction (HCI), an online railway information and booking application (RailSafar) was systematically engineered to resolve long-standing usability bottlenecks in public transit ticketing. By anchoring interface architecture in five foundational Nielsen Usability Heuristics—Visibility of System Status, Match Between System and the Real World, Consistency and Standards, Error Prevention, and Recognition Rather Than Recall—the application delivers a calm, transparent, and resilient user experience. Crucially, the prototype was implemented using purely semantic HTML5 and modular CSS3 without JavaScript, proving that high-performance, accessible, and error-immune user interfaces can be realized through disciplined adherence to fundamental HCI design principles. This submission satisfies all academic requirements prescribed by the Department of Emerging Science and Technology at Maharashtra Institute of Technology, Chhatrapati Sambhajinagar.</w:t>
       </w:r>
     </w:p>
     <w:p>
@@ -3907,7 +3907,7 @@
                 <w:color w:val="000000"/>
                 <w:sz w:val="16"/>
               </w:rPr>
-              <w:t>Pranav Samadhan Khaire (Roll No. 49, TY-C, CSD)</w:t>
+              <w:t>Pranav Samadhan Khaire (Roll No. 49, TY-C, Computer Science and Design)</w:t>
             </w:r>
           </w:p>
           <w:p>

</xml_diff>